<commit_message>
Add bold headings and signature/stamp sections to report
</commit_message>
<xml_diff>
--- a/Industrial_Attachment_Report_Lynia_Finance.docx
+++ b/Industrial_Attachment_Report_Lynia_Finance.docx
@@ -10,6 +10,7 @@
       <w:r>
         <w:rPr>
           <w:rFonts w:ascii="Calibri" w:hAnsi="Calibri"/>
+          <w:b/>
           <w:color w:val="000000"/>
           <w:sz w:val="24"/>
         </w:rPr>
@@ -38,6 +39,7 @@
       <w:r>
         <w:rPr>
           <w:rFonts w:ascii="Calibri" w:hAnsi="Calibri"/>
+          <w:b/>
           <w:color w:val="000000"/>
           <w:sz w:val="24"/>
         </w:rPr>
@@ -72,6 +74,7 @@
       <w:r>
         <w:rPr>
           <w:rFonts w:ascii="Calibri" w:hAnsi="Calibri"/>
+          <w:b/>
           <w:color w:val="000000"/>
           <w:sz w:val="24"/>
         </w:rPr>
@@ -86,6 +89,7 @@
       <w:r>
         <w:rPr>
           <w:rFonts w:ascii="Calibri" w:hAnsi="Calibri"/>
+          <w:b/>
           <w:color w:val="000000"/>
           <w:sz w:val="24"/>
         </w:rPr>
@@ -100,6 +104,7 @@
       <w:r>
         <w:rPr>
           <w:rFonts w:ascii="Calibri" w:hAnsi="Calibri"/>
+          <w:b/>
           <w:color w:val="000000"/>
           <w:sz w:val="24"/>
         </w:rPr>
@@ -114,6 +119,7 @@
       <w:r>
         <w:rPr>
           <w:rFonts w:ascii="Calibri" w:hAnsi="Calibri"/>
+          <w:b/>
           <w:color w:val="000000"/>
           <w:sz w:val="24"/>
         </w:rPr>
@@ -128,6 +134,7 @@
       <w:r>
         <w:rPr>
           <w:rFonts w:ascii="Calibri" w:hAnsi="Calibri"/>
+          <w:b/>
           <w:color w:val="000000"/>
           <w:sz w:val="24"/>
         </w:rPr>
@@ -142,6 +149,7 @@
       <w:r>
         <w:rPr>
           <w:rFonts w:ascii="Calibri" w:hAnsi="Calibri"/>
+          <w:b/>
           <w:color w:val="000000"/>
           <w:sz w:val="24"/>
         </w:rPr>
@@ -156,6 +164,7 @@
       <w:r>
         <w:rPr>
           <w:rFonts w:ascii="Calibri" w:hAnsi="Calibri"/>
+          <w:b/>
           <w:color w:val="000000"/>
           <w:sz w:val="24"/>
         </w:rPr>
@@ -170,6 +179,7 @@
       <w:r>
         <w:rPr>
           <w:rFonts w:ascii="Calibri" w:hAnsi="Calibri"/>
+          <w:b/>
           <w:color w:val="000000"/>
           <w:sz w:val="24"/>
         </w:rPr>
@@ -212,6 +222,7 @@
       <w:r>
         <w:rPr>
           <w:rFonts w:ascii="Calibri" w:hAnsi="Calibri"/>
+          <w:b/>
           <w:color w:val="000000"/>
           <w:sz w:val="24"/>
         </w:rPr>
@@ -240,6 +251,7 @@
       <w:r>
         <w:rPr>
           <w:rFonts w:ascii="Calibri" w:hAnsi="Calibri"/>
+          <w:b/>
           <w:color w:val="000000"/>
           <w:sz w:val="24"/>
         </w:rPr>
@@ -254,6 +266,7 @@
       <w:r>
         <w:rPr>
           <w:rFonts w:ascii="Calibri" w:hAnsi="Calibri"/>
+          <w:b/>
           <w:color w:val="000000"/>
           <w:sz w:val="24"/>
         </w:rPr>
@@ -268,6 +281,7 @@
       <w:r>
         <w:rPr>
           <w:rFonts w:ascii="Calibri" w:hAnsi="Calibri"/>
+          <w:b/>
           <w:color w:val="000000"/>
           <w:sz w:val="24"/>
         </w:rPr>
@@ -282,6 +296,7 @@
       <w:r>
         <w:rPr>
           <w:rFonts w:ascii="Calibri" w:hAnsi="Calibri"/>
+          <w:b/>
           <w:color w:val="000000"/>
           <w:sz w:val="24"/>
         </w:rPr>
@@ -296,6 +311,7 @@
       <w:r>
         <w:rPr>
           <w:rFonts w:ascii="Calibri" w:hAnsi="Calibri"/>
+          <w:b/>
           <w:color w:val="000000"/>
           <w:sz w:val="24"/>
         </w:rPr>
@@ -310,6 +326,7 @@
       <w:r>
         <w:rPr>
           <w:rFonts w:ascii="Calibri" w:hAnsi="Calibri"/>
+          <w:b/>
           <w:color w:val="000000"/>
           <w:sz w:val="24"/>
         </w:rPr>
@@ -324,6 +341,7 @@
       <w:r>
         <w:rPr>
           <w:rFonts w:ascii="Calibri" w:hAnsi="Calibri"/>
+          <w:b/>
           <w:color w:val="000000"/>
           <w:sz w:val="24"/>
         </w:rPr>
@@ -352,6 +370,7 @@
       <w:r>
         <w:rPr>
           <w:rFonts w:ascii="Calibri" w:hAnsi="Calibri"/>
+          <w:b/>
           <w:color w:val="000000"/>
           <w:sz w:val="24"/>
         </w:rPr>
@@ -366,6 +385,7 @@
       <w:r>
         <w:rPr>
           <w:rFonts w:ascii="Calibri" w:hAnsi="Calibri"/>
+          <w:b/>
           <w:color w:val="000000"/>
           <w:sz w:val="24"/>
         </w:rPr>
@@ -394,6 +414,7 @@
       <w:r>
         <w:rPr>
           <w:rFonts w:ascii="Calibri" w:hAnsi="Calibri"/>
+          <w:b/>
           <w:color w:val="000000"/>
           <w:sz w:val="24"/>
         </w:rPr>
@@ -422,6 +443,7 @@
       <w:r>
         <w:rPr>
           <w:rFonts w:ascii="Calibri" w:hAnsi="Calibri"/>
+          <w:b/>
           <w:color w:val="000000"/>
           <w:sz w:val="24"/>
         </w:rPr>
@@ -436,6 +458,7 @@
       <w:r>
         <w:rPr>
           <w:rFonts w:ascii="Calibri" w:hAnsi="Calibri"/>
+          <w:b/>
           <w:color w:val="000000"/>
           <w:sz w:val="24"/>
         </w:rPr>
@@ -450,6 +473,7 @@
       <w:r>
         <w:rPr>
           <w:rFonts w:ascii="Calibri" w:hAnsi="Calibri"/>
+          <w:b/>
           <w:color w:val="000000"/>
           <w:sz w:val="24"/>
         </w:rPr>
@@ -464,6 +488,7 @@
       <w:r>
         <w:rPr>
           <w:rFonts w:ascii="Calibri" w:hAnsi="Calibri"/>
+          <w:b/>
           <w:color w:val="000000"/>
           <w:sz w:val="24"/>
         </w:rPr>
@@ -478,6 +503,7 @@
       <w:r>
         <w:rPr>
           <w:rFonts w:ascii="Calibri" w:hAnsi="Calibri"/>
+          <w:b/>
           <w:color w:val="000000"/>
           <w:sz w:val="24"/>
         </w:rPr>
@@ -492,6 +518,7 @@
       <w:r>
         <w:rPr>
           <w:rFonts w:ascii="Calibri" w:hAnsi="Calibri"/>
+          <w:b/>
           <w:color w:val="000000"/>
           <w:sz w:val="24"/>
         </w:rPr>
@@ -506,6 +533,7 @@
       <w:r>
         <w:rPr>
           <w:rFonts w:ascii="Calibri" w:hAnsi="Calibri"/>
+          <w:b/>
           <w:color w:val="000000"/>
           <w:sz w:val="24"/>
         </w:rPr>
@@ -534,6 +562,7 @@
       <w:r>
         <w:rPr>
           <w:rFonts w:ascii="Calibri" w:hAnsi="Calibri"/>
+          <w:b/>
           <w:color w:val="000000"/>
           <w:sz w:val="24"/>
         </w:rPr>
@@ -562,6 +591,7 @@
       <w:r>
         <w:rPr>
           <w:rFonts w:ascii="Calibri" w:hAnsi="Calibri"/>
+          <w:b/>
           <w:color w:val="000000"/>
           <w:sz w:val="24"/>
         </w:rPr>
@@ -576,6 +606,7 @@
       <w:r>
         <w:rPr>
           <w:rFonts w:ascii="Calibri" w:hAnsi="Calibri"/>
+          <w:b/>
           <w:color w:val="000000"/>
           <w:sz w:val="24"/>
         </w:rPr>
@@ -604,6 +635,7 @@
       <w:r>
         <w:rPr>
           <w:rFonts w:ascii="Calibri" w:hAnsi="Calibri"/>
+          <w:b/>
           <w:color w:val="000000"/>
           <w:sz w:val="24"/>
         </w:rPr>
@@ -632,6 +664,7 @@
       <w:r>
         <w:rPr>
           <w:rFonts w:ascii="Calibri" w:hAnsi="Calibri"/>
+          <w:b/>
           <w:color w:val="000000"/>
           <w:sz w:val="24"/>
         </w:rPr>
@@ -716,6 +749,7 @@
       <w:r>
         <w:rPr>
           <w:rFonts w:ascii="Calibri" w:hAnsi="Calibri"/>
+          <w:b/>
           <w:color w:val="000000"/>
           <w:sz w:val="24"/>
         </w:rPr>
@@ -730,6 +764,7 @@
       <w:r>
         <w:rPr>
           <w:rFonts w:ascii="Calibri" w:hAnsi="Calibri"/>
+          <w:b/>
           <w:color w:val="000000"/>
           <w:sz w:val="24"/>
         </w:rPr>
@@ -744,6 +779,7 @@
       <w:r>
         <w:rPr>
           <w:rFonts w:ascii="Calibri" w:hAnsi="Calibri"/>
+          <w:b/>
           <w:color w:val="000000"/>
           <w:sz w:val="24"/>
         </w:rPr>
@@ -772,6 +808,7 @@
       <w:r>
         <w:rPr>
           <w:rFonts w:ascii="Calibri" w:hAnsi="Calibri"/>
+          <w:b/>
           <w:color w:val="000000"/>
           <w:sz w:val="24"/>
         </w:rPr>
@@ -786,6 +823,7 @@
       <w:r>
         <w:rPr>
           <w:rFonts w:ascii="Calibri" w:hAnsi="Calibri"/>
+          <w:b/>
           <w:color w:val="000000"/>
           <w:sz w:val="24"/>
         </w:rPr>
@@ -814,6 +852,7 @@
       <w:r>
         <w:rPr>
           <w:rFonts w:ascii="Calibri" w:hAnsi="Calibri"/>
+          <w:b/>
           <w:color w:val="000000"/>
           <w:sz w:val="24"/>
         </w:rPr>
@@ -828,6 +867,7 @@
       <w:r>
         <w:rPr>
           <w:rFonts w:ascii="Calibri" w:hAnsi="Calibri"/>
+          <w:b/>
           <w:color w:val="000000"/>
           <w:sz w:val="24"/>
         </w:rPr>
@@ -884,6 +924,7 @@
       <w:r>
         <w:rPr>
           <w:rFonts w:ascii="Calibri" w:hAnsi="Calibri"/>
+          <w:b/>
           <w:color w:val="000000"/>
           <w:sz w:val="24"/>
         </w:rPr>
@@ -912,6 +953,7 @@
       <w:r>
         <w:rPr>
           <w:rFonts w:ascii="Calibri" w:hAnsi="Calibri"/>
+          <w:b/>
           <w:color w:val="000000"/>
           <w:sz w:val="24"/>
         </w:rPr>
@@ -926,6 +968,7 @@
       <w:r>
         <w:rPr>
           <w:rFonts w:ascii="Calibri" w:hAnsi="Calibri"/>
+          <w:b/>
           <w:color w:val="000000"/>
           <w:sz w:val="24"/>
         </w:rPr>
@@ -940,6 +983,7 @@
       <w:r>
         <w:rPr>
           <w:rFonts w:ascii="Calibri" w:hAnsi="Calibri"/>
+          <w:b/>
           <w:color w:val="000000"/>
           <w:sz w:val="24"/>
         </w:rPr>
@@ -982,6 +1026,7 @@
       <w:r>
         <w:rPr>
           <w:rFonts w:ascii="Calibri" w:hAnsi="Calibri"/>
+          <w:b/>
           <w:color w:val="000000"/>
           <w:sz w:val="24"/>
         </w:rPr>
@@ -996,6 +1041,7 @@
       <w:r>
         <w:rPr>
           <w:rFonts w:ascii="Calibri" w:hAnsi="Calibri"/>
+          <w:b/>
           <w:color w:val="000000"/>
           <w:sz w:val="24"/>
         </w:rPr>
@@ -1024,6 +1070,7 @@
       <w:r>
         <w:rPr>
           <w:rFonts w:ascii="Calibri" w:hAnsi="Calibri"/>
+          <w:b/>
           <w:color w:val="000000"/>
           <w:sz w:val="24"/>
         </w:rPr>
@@ -1052,6 +1099,7 @@
       <w:r>
         <w:rPr>
           <w:rFonts w:ascii="Calibri" w:hAnsi="Calibri"/>
+          <w:b/>
           <w:color w:val="000000"/>
           <w:sz w:val="24"/>
         </w:rPr>
@@ -1080,6 +1128,7 @@
       <w:r>
         <w:rPr>
           <w:rFonts w:ascii="Calibri" w:hAnsi="Calibri"/>
+          <w:b/>
           <w:color w:val="000000"/>
           <w:sz w:val="24"/>
         </w:rPr>
@@ -1122,6 +1171,7 @@
       <w:r>
         <w:rPr>
           <w:rFonts w:ascii="Calibri" w:hAnsi="Calibri"/>
+          <w:b/>
           <w:color w:val="000000"/>
           <w:sz w:val="24"/>
         </w:rPr>
@@ -1136,6 +1186,7 @@
       <w:r>
         <w:rPr>
           <w:rFonts w:ascii="Calibri" w:hAnsi="Calibri"/>
+          <w:b/>
           <w:color w:val="000000"/>
           <w:sz w:val="24"/>
         </w:rPr>
@@ -1164,6 +1215,7 @@
       <w:r>
         <w:rPr>
           <w:rFonts w:ascii="Calibri" w:hAnsi="Calibri"/>
+          <w:b/>
           <w:color w:val="000000"/>
           <w:sz w:val="24"/>
         </w:rPr>
@@ -1220,6 +1272,7 @@
       <w:r>
         <w:rPr>
           <w:rFonts w:ascii="Calibri" w:hAnsi="Calibri"/>
+          <w:b/>
           <w:color w:val="000000"/>
           <w:sz w:val="24"/>
         </w:rPr>
@@ -1318,6 +1371,7 @@
       <w:r>
         <w:rPr>
           <w:rFonts w:ascii="Calibri" w:hAnsi="Calibri"/>
+          <w:b/>
           <w:color w:val="000000"/>
           <w:sz w:val="24"/>
         </w:rPr>
@@ -1332,6 +1386,7 @@
       <w:r>
         <w:rPr>
           <w:rFonts w:ascii="Calibri" w:hAnsi="Calibri"/>
+          <w:b/>
           <w:color w:val="000000"/>
           <w:sz w:val="24"/>
         </w:rPr>
@@ -1374,6 +1429,7 @@
       <w:r>
         <w:rPr>
           <w:rFonts w:ascii="Calibri" w:hAnsi="Calibri"/>
+          <w:b/>
           <w:color w:val="000000"/>
           <w:sz w:val="24"/>
         </w:rPr>
@@ -1402,6 +1458,7 @@
       <w:r>
         <w:rPr>
           <w:rFonts w:ascii="Calibri" w:hAnsi="Calibri"/>
+          <w:b/>
           <w:color w:val="000000"/>
           <w:sz w:val="24"/>
         </w:rPr>
@@ -1416,6 +1473,7 @@
       <w:r>
         <w:rPr>
           <w:rFonts w:ascii="Calibri" w:hAnsi="Calibri"/>
+          <w:b/>
           <w:color w:val="000000"/>
           <w:sz w:val="24"/>
         </w:rPr>
@@ -1520,6 +1578,137 @@
         <w:t>Definition: Transaction volume segmented by region and district.</w:t>
         <w:br/>
         <w:t>Use: Identifying geographic growth areas and market concentration.</w:t>
+      </w:r>
+    </w:p>
+    <w:p>
+      <w:pPr>
+        <w:spacing w:before="240" w:after="120"/>
+      </w:pPr>
+      <w:r>
+        <w:rPr>
+          <w:rFonts w:ascii="Calibri" w:hAnsi="Calibri"/>
+          <w:b/>
+          <w:color w:val="000000"/>
+          <w:sz w:val="24"/>
+        </w:rPr>
+        <w:t>DECLARATION AND SIGNATURES</w:t>
+      </w:r>
+    </w:p>
+    <w:p>
+      <w:pPr>
+        <w:spacing w:after="240"/>
+      </w:pPr>
+      <w:r>
+        <w:rPr>
+          <w:rFonts w:ascii="Calibri" w:hAnsi="Calibri"/>
+          <w:color w:val="000000"/>
+          <w:sz w:val="22"/>
+        </w:rPr>
+        <w:t>I hereby declare that the information recorded in this report is a true and accurate account of the industrial attachment work performed at Lynia Finance (Pvt) Ltd.</w:t>
+      </w:r>
+    </w:p>
+    <w:p/>
+    <w:p>
+      <w:pPr>
+        <w:spacing w:before="120" w:after="360"/>
+      </w:pPr>
+      <w:r>
+        <w:rPr>
+          <w:b/>
+          <w:sz w:val="22"/>
+        </w:rPr>
+        <w:t xml:space="preserve">Student Signature: </w:t>
+      </w:r>
+    </w:p>
+    <w:p>
+      <w:r>
+        <w:t>____________________________________________________________</w:t>
+      </w:r>
+    </w:p>
+    <w:p>
+      <w:pPr>
+        <w:spacing w:after="240"/>
+      </w:pPr>
+      <w:r>
+        <w:rPr>
+          <w:i/>
+          <w:sz w:val="20"/>
+        </w:rPr>
+        <w:t>Name: _Name: _Name: _Name: _Name: _Name: _Name: _Name: _Name: _Name: _</w:t>
+      </w:r>
+    </w:p>
+    <w:p>
+      <w:pPr>
+        <w:spacing w:after="480"/>
+      </w:pPr>
+      <w:r>
+        <w:rPr>
+          <w:sz w:val="22"/>
+        </w:rPr>
+        <w:t>Date: ________________________________</w:t>
+      </w:r>
+    </w:p>
+    <w:p/>
+    <w:p>
+      <w:pPr>
+        <w:spacing w:before="120" w:after="360"/>
+      </w:pPr>
+      <w:r>
+        <w:rPr>
+          <w:b/>
+          <w:sz w:val="22"/>
+        </w:rPr>
+        <w:t xml:space="preserve">Supervisor Signature: </w:t>
+      </w:r>
+    </w:p>
+    <w:p>
+      <w:r>
+        <w:t>____________________________________________________________</w:t>
+      </w:r>
+    </w:p>
+    <w:p>
+      <w:pPr>
+        <w:spacing w:after="240"/>
+      </w:pPr>
+      <w:r>
+        <w:rPr>
+          <w:i/>
+          <w:sz w:val="20"/>
+        </w:rPr>
+        <w:t>Name: _Name: _Name: _Name: _Name: _Name: _Name: _Name: _Name: _Name: _</w:t>
+      </w:r>
+    </w:p>
+    <w:p>
+      <w:pPr>
+        <w:spacing w:after="480"/>
+      </w:pPr>
+      <w:r>
+        <w:rPr>
+          <w:sz w:val="22"/>
+        </w:rPr>
+        <w:t>Date: ________________________________</w:t>
+      </w:r>
+    </w:p>
+    <w:p/>
+    <w:p>
+      <w:pPr>
+        <w:spacing w:before="120" w:after="360"/>
+      </w:pPr>
+      <w:r>
+        <w:rPr>
+          <w:b/>
+          <w:sz w:val="22"/>
+        </w:rPr>
+        <w:t>Company Stamp / Official Seal:</w:t>
+      </w:r>
+    </w:p>
+    <w:p>
+      <w:pPr>
+        <w:spacing w:after="480"/>
+      </w:pPr>
+      <w:r>
+        <w:br/>
+        <w:br/>
       </w:r>
     </w:p>
     <w:sectPr>

</xml_diff>